<commit_message>
Pharm Exam 2 guide: eye-drop vasoconstrictor lines move from Bile acid sequestrants to Allergy and the red eye
The 'Find it in the study guide' button now opens section 1.4 for those eight ocular questions. Built from the committed guide, so unfinished Lecture 8 work stays out; strict link check passes.

Co-Authored-By: Claude Sonnet 5.5 <noreply@anthropic.com>
</commit_message>
<xml_diff>
--- a/Pharmacology I Exam 2/pharm-exam-2-study-guide.docx
+++ b/Pharmacology I Exam 2/pharm-exam-2-study-guide.docx
@@ -2795,7 +2795,7 @@
           <w:i w:val="0"/>
           <w:sz w:val="20"/>
         </w:rPr>
-        <w:t>Over-the-counter ocular antihistamine.</w:t>
+        <w:t>Rebound hyperemia from ocular vasoconstrictors.</w:t>
       </w:r>
       <w:r>
         <w:rPr>
@@ -2803,7 +2803,7 @@
           <w:i w:val="0"/>
           <w:sz w:val="20"/>
         </w:rPr>
-        <w:t xml:space="preserve"> Ketotifen is an ocular antihistamine available over the counter.</w:t>
+        <w:t xml:space="preserve"> Alpha-adrenergic agonist drops constrict vessels to reduce redness and conjunctival edema; constant activation downregulates alpha-1 receptors, so on stopping, vessels dilate because fewer receptors remain for endogenous noradrenaline and adrenaline.</w:t>
       </w:r>
     </w:p>
     <w:p>
@@ -2817,7 +2817,7 @@
           <w:i w:val="0"/>
           <w:sz w:val="20"/>
         </w:rPr>
-        <w:t>Over-the-counter ophthalmic antihistamine.</w:t>
+        <w:t>Over-the-counter ocular vasoconstrictors.</w:t>
       </w:r>
       <w:r>
         <w:rPr>
@@ -2825,7 +2825,7 @@
           <w:i w:val="0"/>
           <w:sz w:val="20"/>
         </w:rPr>
-        <w:t xml:space="preserve"> Ketotifen is the over-the-counter agent among the ophthalmic antihistamines.</w:t>
+        <w:t xml:space="preserve"> Use them for under two weeks because of rebound hyperemia, and see a provider if no better in 72 hours, since a red eye that is not improving may be more serious than allergy.</w:t>
       </w:r>
     </w:p>
     <w:p>
@@ -2839,7 +2839,7 @@
           <w:i w:val="0"/>
           <w:sz w:val="20"/>
         </w:rPr>
-        <w:t>Ophthalmic antihistamines.</w:t>
+        <w:t>Vasoconstrictor allergy drops.</w:t>
       </w:r>
       <w:r>
         <w:rPr>
@@ -2847,7 +2847,7 @@
           <w:i w:val="0"/>
           <w:sz w:val="20"/>
         </w:rPr>
-        <w:t xml:space="preserve"> Agents such as olopatadine have an onset within minutes, are dosed once or twice daily, and are typically preferred over mast cell stabilizers for ocular allergy.</w:t>
+        <w:t xml:space="preserve"> The vasoconstrictor activates alpha-adrenergic receptors on vessels, reducing conjunctival edema and redness. It treats the appearance rather than the allergy, so it is paired with an antihistamine in products such as Naphcon-A.</w:t>
       </w:r>
     </w:p>
     <w:p>
@@ -2861,6 +2861,116 @@
           <w:i w:val="0"/>
           <w:sz w:val="20"/>
         </w:rPr>
+        <w:t>Over-the-counter ocular antihistamine.</w:t>
+      </w:r>
+      <w:r>
+        <w:rPr>
+          <w:b w:val="0"/>
+          <w:i w:val="0"/>
+          <w:sz w:val="20"/>
+        </w:rPr>
+        <w:t xml:space="preserve"> Ketotifen is an ocular antihistamine available over the counter.</w:t>
+      </w:r>
+    </w:p>
+    <w:p>
+      <w:pPr>
+        <w:pStyle w:val="ListBullet"/>
+        <w:spacing w:after="40"/>
+      </w:pPr>
+      <w:r>
+        <w:rPr>
+          <w:b/>
+          <w:i w:val="0"/>
+          <w:sz w:val="20"/>
+        </w:rPr>
+        <w:t>Rebound hyperemia.</w:t>
+      </w:r>
+      <w:r>
+        <w:rPr>
+          <w:b w:val="0"/>
+          <w:i w:val="0"/>
+          <w:sz w:val="20"/>
+        </w:rPr>
+        <w:t xml:space="preserve"> Naphazoline, a topical vasoconstrictor eye drop, causes rebound hyperemia after discontinuation if used for too long. Nasal decongestant sprays share the risk.</w:t>
+      </w:r>
+    </w:p>
+    <w:p>
+      <w:pPr>
+        <w:pStyle w:val="ListBullet"/>
+        <w:spacing w:after="40"/>
+      </w:pPr>
+      <w:r>
+        <w:rPr>
+          <w:b/>
+          <w:i w:val="0"/>
+          <w:sz w:val="20"/>
+        </w:rPr>
+        <w:t>Vasoconstrictor eye drop duration.</w:t>
+      </w:r>
+      <w:r>
+        <w:rPr>
+          <w:b w:val="0"/>
+          <w:i w:val="0"/>
+          <w:sz w:val="20"/>
+        </w:rPr>
+        <w:t xml:space="preserve"> Use is for the short term, less than two weeks. Prolonged use leads to rebound hyperemia after the drops are stopped.</w:t>
+      </w:r>
+    </w:p>
+    <w:p>
+      <w:pPr>
+        <w:pStyle w:val="ListBullet"/>
+        <w:spacing w:after="40"/>
+      </w:pPr>
+      <w:r>
+        <w:rPr>
+          <w:b/>
+          <w:i w:val="0"/>
+          <w:sz w:val="20"/>
+        </w:rPr>
+        <w:t>Over-the-counter ophthalmic antihistamine.</w:t>
+      </w:r>
+      <w:r>
+        <w:rPr>
+          <w:b w:val="0"/>
+          <w:i w:val="0"/>
+          <w:sz w:val="20"/>
+        </w:rPr>
+        <w:t xml:space="preserve"> Ketotifen is the over-the-counter agent among the ophthalmic antihistamines.</w:t>
+      </w:r>
+    </w:p>
+    <w:p>
+      <w:pPr>
+        <w:pStyle w:val="ListBullet"/>
+        <w:spacing w:after="40"/>
+      </w:pPr>
+      <w:r>
+        <w:rPr>
+          <w:b/>
+          <w:i w:val="0"/>
+          <w:sz w:val="20"/>
+        </w:rPr>
+        <w:t>Ophthalmic antihistamines.</w:t>
+      </w:r>
+      <w:r>
+        <w:rPr>
+          <w:b w:val="0"/>
+          <w:i w:val="0"/>
+          <w:sz w:val="20"/>
+        </w:rPr>
+        <w:t xml:space="preserve"> Agents such as olopatadine have an onset within minutes, are dosed once or twice daily, and are typically preferred over mast cell stabilizers for ocular allergy.</w:t>
+      </w:r>
+    </w:p>
+    <w:p>
+      <w:pPr>
+        <w:pStyle w:val="ListBullet"/>
+        <w:spacing w:after="40"/>
+      </w:pPr>
+      <w:r>
+        <w:rPr>
+          <w:b/>
+          <w:i w:val="0"/>
+          <w:sz w:val="20"/>
+        </w:rPr>
         <w:t>Antihistamine onset.</w:t>
       </w:r>
       <w:r>
@@ -2870,6 +2980,72 @@
           <w:sz w:val="20"/>
         </w:rPr>
         <w:t xml:space="preserve"> An ophthalmic antihistamine acts within minutes, with fast onset but slower time to full efficacy. Allow two weeks to judge the full effect.</w:t>
+      </w:r>
+    </w:p>
+    <w:p>
+      <w:pPr>
+        <w:pStyle w:val="ListBullet"/>
+        <w:spacing w:after="40"/>
+      </w:pPr>
+      <w:r>
+        <w:rPr>
+          <w:b/>
+          <w:i w:val="0"/>
+          <w:sz w:val="20"/>
+        </w:rPr>
+        <w:t>Redness-relief drop duration.</w:t>
+      </w:r>
+      <w:r>
+        <w:rPr>
+          <w:b w:val="0"/>
+          <w:i w:val="0"/>
+          <w:sz w:val="20"/>
+        </w:rPr>
+        <w:t xml:space="preserve"> Use should be no more than two weeks. If there is no improvement within 72 hours, the patient should stop and be seen.</w:t>
+      </w:r>
+    </w:p>
+    <w:p>
+      <w:pPr>
+        <w:pStyle w:val="ListBullet"/>
+        <w:spacing w:after="40"/>
+      </w:pPr>
+      <w:r>
+        <w:rPr>
+          <w:b/>
+          <w:i w:val="0"/>
+          <w:sz w:val="20"/>
+        </w:rPr>
+        <w:t>No improvement with vasoconstrictor drops.</w:t>
+      </w:r>
+      <w:r>
+        <w:rPr>
+          <w:b w:val="0"/>
+          <w:i w:val="0"/>
+          <w:sz w:val="20"/>
+        </w:rPr>
+        <w:t xml:space="preserve"> No improvement within 72 hours is the trigger to stop the drop and see a provider, because something more serious may be going on.</w:t>
+      </w:r>
+    </w:p>
+    <w:p>
+      <w:pPr>
+        <w:pStyle w:val="ListBullet"/>
+        <w:spacing w:after="40"/>
+      </w:pPr>
+      <w:r>
+        <w:rPr>
+          <w:b/>
+          <w:i w:val="0"/>
+          <w:sz w:val="20"/>
+        </w:rPr>
+        <w:t>Rebound hyperemia counseling.</w:t>
+      </w:r>
+      <w:r>
+        <w:rPr>
+          <w:b w:val="0"/>
+          <w:i w:val="0"/>
+          <w:sz w:val="20"/>
+        </w:rPr>
+        <w:t xml:space="preserve"> Beyond about two weeks of daily redness-relief drops, stopping leaves the eye redder than it started. This is rebound hyperemia.</w:t>
       </w:r>
     </w:p>
     <w:p>
@@ -24162,7 +24338,7 @@
           <w:i w:val="0"/>
           <w:sz w:val="20"/>
         </w:rPr>
-        <w:t>Rebound hyperemia from ocular vasoconstrictors.</w:t>
+        <w:t>Bile acid sequestrants and triglycerides.</w:t>
       </w:r>
       <w:r>
         <w:rPr>
@@ -24170,7 +24346,7 @@
           <w:i w:val="0"/>
           <w:sz w:val="20"/>
         </w:rPr>
-        <w:t xml:space="preserve"> Alpha-adrenergic agonist drops constrict vessels to reduce redness and conjunctival edema; constant activation downregulates alpha-1 receptors, so on stopping, vessels dilate because fewer receptors remain for endogenous noradrenaline and adrenaline.</w:t>
+        <w:t xml:space="preserve"> Resins may increase VLDL (very low-density lipoprotein) production and raise triglycerides, so they are avoided when triglycerides are high. On the lipid comparison they show no change or a rise in triglycerides.</w:t>
       </w:r>
     </w:p>
     <w:p>
@@ -24184,7 +24360,7 @@
           <w:i w:val="0"/>
           <w:sz w:val="20"/>
         </w:rPr>
-        <w:t>Over-the-counter ocular vasoconstrictors.</w:t>
+        <w:t>Resin effect on bile acids.</w:t>
       </w:r>
       <w:r>
         <w:rPr>
@@ -24192,7 +24368,7 @@
           <w:i w:val="0"/>
           <w:sz w:val="20"/>
         </w:rPr>
-        <w:t xml:space="preserve"> Use them for under two weeks because of rebound hyperemia, and see a provider if no better in 72 hours, since a red eye that is not improving may be more serious than allergy.</w:t>
+        <w:t xml:space="preserve"> When resins deplete the bile acid pool, cholesterol 7-alpha hydroxylase activity increases and converts more cholesterol to bile acids. The liver also adds LDL receptors, increasing VLDL and LDL removal.</w:t>
       </w:r>
     </w:p>
     <w:p>
@@ -24206,7 +24382,7 @@
           <w:i w:val="0"/>
           <w:sz w:val="20"/>
         </w:rPr>
-        <w:t>Vasoconstrictor allergy drops.</w:t>
+        <w:t>Long-term resin risk.</w:t>
       </w:r>
       <w:r>
         <w:rPr>
@@ -24214,183 +24390,7 @@
           <w:i w:val="0"/>
           <w:sz w:val="20"/>
         </w:rPr>
-        <w:t xml:space="preserve"> The vasoconstrictor activates alpha-adrenergic receptors on vessels, reducing conjunctival edema and redness. It treats the appearance rather than the allergy, so it is paired with an antihistamine in products such as Naphcon-A.</w:t>
-      </w:r>
-    </w:p>
-    <w:p>
-      <w:pPr>
-        <w:pStyle w:val="ListBullet"/>
-        <w:spacing w:after="40"/>
-      </w:pPr>
-      <w:r>
-        <w:rPr>
-          <w:b/>
-          <w:i w:val="0"/>
-          <w:sz w:val="20"/>
-        </w:rPr>
-        <w:t>Bile acid sequestrants and triglycerides.</w:t>
-      </w:r>
-      <w:r>
-        <w:rPr>
-          <w:b w:val="0"/>
-          <w:i w:val="0"/>
-          <w:sz w:val="20"/>
-        </w:rPr>
-        <w:t xml:space="preserve"> Resins may increase VLDL (very low-density lipoprotein) production and raise triglycerides, so they are avoided when triglycerides are high. On the lipid comparison they show no change or a rise in triglycerides.</w:t>
-      </w:r>
-    </w:p>
-    <w:p>
-      <w:pPr>
-        <w:pStyle w:val="ListBullet"/>
-        <w:spacing w:after="40"/>
-      </w:pPr>
-      <w:r>
-        <w:rPr>
-          <w:b/>
-          <w:i w:val="0"/>
-          <w:sz w:val="20"/>
-        </w:rPr>
-        <w:t>Resin effect on bile acids.</w:t>
-      </w:r>
-      <w:r>
-        <w:rPr>
-          <w:b w:val="0"/>
-          <w:i w:val="0"/>
-          <w:sz w:val="20"/>
-        </w:rPr>
-        <w:t xml:space="preserve"> When resins deplete the bile acid pool, cholesterol 7-alpha hydroxylase activity increases and converts more cholesterol to bile acids. The liver also adds LDL receptors, increasing VLDL and LDL removal.</w:t>
-      </w:r>
-    </w:p>
-    <w:p>
-      <w:pPr>
-        <w:pStyle w:val="ListBullet"/>
-        <w:spacing w:after="40"/>
-      </w:pPr>
-      <w:r>
-        <w:rPr>
-          <w:b/>
-          <w:i w:val="0"/>
-          <w:sz w:val="20"/>
-        </w:rPr>
-        <w:t>Long-term resin risk.</w:t>
-      </w:r>
-      <w:r>
-        <w:rPr>
-          <w:b w:val="0"/>
-          <w:i w:val="0"/>
-          <w:sz w:val="20"/>
-        </w:rPr>
         <w:t xml:space="preserve"> Resins such as cholestyramine cause malabsorption of the fat-soluble vitamins A, D, E and K and of folic acid.</w:t>
-      </w:r>
-    </w:p>
-    <w:p>
-      <w:pPr>
-        <w:pStyle w:val="ListBullet"/>
-        <w:spacing w:after="40"/>
-      </w:pPr>
-      <w:r>
-        <w:rPr>
-          <w:b/>
-          <w:i w:val="0"/>
-          <w:sz w:val="20"/>
-        </w:rPr>
-        <w:t>Rebound hyperemia.</w:t>
-      </w:r>
-      <w:r>
-        <w:rPr>
-          <w:b w:val="0"/>
-          <w:i w:val="0"/>
-          <w:sz w:val="20"/>
-        </w:rPr>
-        <w:t xml:space="preserve"> Naphazoline, a topical vasoconstrictor eye drop, causes rebound hyperemia after discontinuation if used for too long. Nasal decongestant sprays share the risk.</w:t>
-      </w:r>
-    </w:p>
-    <w:p>
-      <w:pPr>
-        <w:pStyle w:val="ListBullet"/>
-        <w:spacing w:after="40"/>
-      </w:pPr>
-      <w:r>
-        <w:rPr>
-          <w:b/>
-          <w:i w:val="0"/>
-          <w:sz w:val="20"/>
-        </w:rPr>
-        <w:t>Vasoconstrictor eye drop duration.</w:t>
-      </w:r>
-      <w:r>
-        <w:rPr>
-          <w:b w:val="0"/>
-          <w:i w:val="0"/>
-          <w:sz w:val="20"/>
-        </w:rPr>
-        <w:t xml:space="preserve"> Use is for the short term, less than two weeks. Prolonged use leads to rebound hyperemia after the drops are stopped.</w:t>
-      </w:r>
-    </w:p>
-    <w:p>
-      <w:pPr>
-        <w:pStyle w:val="ListBullet"/>
-        <w:spacing w:after="40"/>
-      </w:pPr>
-      <w:r>
-        <w:rPr>
-          <w:b/>
-          <w:i w:val="0"/>
-          <w:sz w:val="20"/>
-        </w:rPr>
-        <w:t>Redness-relief drop duration.</w:t>
-      </w:r>
-      <w:r>
-        <w:rPr>
-          <w:b w:val="0"/>
-          <w:i w:val="0"/>
-          <w:sz w:val="20"/>
-        </w:rPr>
-        <w:t xml:space="preserve"> Use should be no more than two weeks. If there is no improvement within 72 hours, the patient should stop and be seen.</w:t>
-      </w:r>
-    </w:p>
-    <w:p>
-      <w:pPr>
-        <w:pStyle w:val="ListBullet"/>
-        <w:spacing w:after="40"/>
-      </w:pPr>
-      <w:r>
-        <w:rPr>
-          <w:b/>
-          <w:i w:val="0"/>
-          <w:sz w:val="20"/>
-        </w:rPr>
-        <w:t>No improvement with vasoconstrictor drops.</w:t>
-      </w:r>
-      <w:r>
-        <w:rPr>
-          <w:b w:val="0"/>
-          <w:i w:val="0"/>
-          <w:sz w:val="20"/>
-        </w:rPr>
-        <w:t xml:space="preserve"> No improvement within 72 hours is the trigger to stop the drop and see a provider, because something more serious may be going on.</w:t>
-      </w:r>
-    </w:p>
-    <w:p>
-      <w:pPr>
-        <w:pStyle w:val="ListBullet"/>
-        <w:spacing w:after="40"/>
-      </w:pPr>
-      <w:r>
-        <w:rPr>
-          <w:b/>
-          <w:i w:val="0"/>
-          <w:sz w:val="20"/>
-        </w:rPr>
-        <w:t>Rebound hyperemia counseling.</w:t>
-      </w:r>
-      <w:r>
-        <w:rPr>
-          <w:b w:val="0"/>
-          <w:i w:val="0"/>
-          <w:sz w:val="20"/>
-        </w:rPr>
-        <w:t xml:space="preserve"> Beyond about two weeks of daily redness-relief drops, stopping leaves the eye redder than it started. This is rebound hyperemia.</w:t>
       </w:r>
     </w:p>
     <w:p>

</xml_diff>